<commit_message>
Switch output format from xlsx to CSV
CSV requires no third-party libraries (uses Python standard library only),
making the listener simpler to deploy — especially on Raspberry Pi OS where
pip install into the system Python is blocked.

- webhook_listener.py: replace openpyxl with csv module; files now named
  mist_nac_YYYY-MM-DD.csv; header written only on first creation
- requirements.txt: no longer lists any dependencies
- README.md: updated install/run instructions accordingly
- User Guide.docx: updated all xlsx/Excel/openpyxl references to CSV;
  removed venv setup steps; simplified troubleshooting table
- setup.sh: removed (no longer needed)
- .gitignore: added to exclude generated data files and build artefacts

Co-Authored-By: Claude Sonnet 4.6 <noreply@anthropic.com>
</commit_message>
<xml_diff>
--- a/User Guide.docx
+++ b/User Guide.docx
@@ -254,7 +254,7 @@
           <w:sz w:val="22"/>
           <w:szCs w:val="22"/>
         </w:rPr>
-        <w:t xml:space="preserve">Each event is appended to a dated Excel file (e.g. mist_nac_2026-06-22.xlsx). A new file is created automatically at midnight so records are grouped by calendar day.</w:t>
+        <w:t xml:space="preserve">Each event is appended to a dated CSV file (e.g. mist_nac_2026-06-22.csv). A new file is created automatically at midnight so records are grouped by calendar day.</w:t>
       </w:r>
     </w:p>
     <w:p>
@@ -452,7 +452,7 @@
                 <w:sz w:val="20"/>
                 <w:szCs w:val="20"/>
               </w:rPr>
-              <w:t xml:space="preserve">openpyxl</w:t>
+              <w:t xml:space="preserve">Dependencies</w:t>
             </w:r>
           </w:p>
         </w:tc>
@@ -480,7 +480,7 @@
                 <w:sz w:val="20"/>
                 <w:szCs w:val="20"/>
               </w:rPr>
-              <w:t xml:space="preserve">Python library for Excel file creation (installed via pip)</w:t>
+              <w:t xml:space="preserve">None — only the Python standard library is required (csv and http.server are built in).</w:t>
             </w:r>
           </w:p>
         </w:tc>
@@ -600,72 +600,7 @@
                 <w:sz w:val="20"/>
                 <w:szCs w:val="20"/>
               </w:rPr>
-              <w:t xml:space="preserve">Linux, macOS, or Windows — any platform that runs Python 3</w:t>
-            </w:r>
-          </w:p>
-        </w:tc>
-      </w:tr>
-    </w:tbl>
-    <w:p>
-      <w:pPr>
-        <w:spacing w:after="60" w:before="60"/>
-      </w:pPr>
-      <w:r>
-        <w:t xml:space="preserve"/>
-      </w:r>
-    </w:p>
-    <w:tbl>
-      <w:tblPr>
-        <w:tblW w:type="dxa" w:w="9360"/>
-        <w:tblBorders>
-          <w:top w:val="single" w:color="auto" w:sz="4"/>
-          <w:left w:val="single" w:color="auto" w:sz="4"/>
-          <w:bottom w:val="single" w:color="auto" w:sz="4"/>
-          <w:right w:val="single" w:color="auto" w:sz="4"/>
-          <w:insideH w:val="single" w:color="auto" w:sz="4"/>
-          <w:insideV w:val="single" w:color="auto" w:sz="4"/>
-        </w:tblBorders>
-      </w:tblPr>
-      <w:tblGrid>
-        <w:gridCol w:w="9360"/>
-      </w:tblGrid>
-      <w:tr>
-        <w:tc>
-          <w:tcPr>
-            <w:tcW w:type="dxa" w:w="9360"/>
-            <w:tcBorders>
-              <w:top w:val="single" w:color="1F5C8B" w:sz="1"/>
-              <w:left w:val="single" w:color="1F5C8B" w:sz="1"/>
-              <w:bottom w:val="single" w:color="1F5C8B" w:sz="1"/>
-              <w:right w:val="single" w:color="1F5C8B" w:sz="1"/>
-            </w:tcBorders>
-            <w:shd w:fill="EBF3FA" w:val="clear"/>
-            <w:tcMar>
-              <w:top w:type="dxa" w:w="120"/>
-              <w:left w:type="dxa" w:w="160"/>
-              <w:bottom w:type="dxa" w:w="120"/>
-              <w:right w:type="dxa" w:w="160"/>
-            </w:tcMar>
-          </w:tcPr>
-          <w:p>
-            <w:r>
-              <w:rPr>
-                <w:rFonts w:ascii="Arial" w:cs="Arial" w:eastAsia="Arial" w:hAnsi="Arial"/>
-                <w:b/>
-                <w:bCs/>
-                <w:color w:val="1F5C8B"/>
-                <w:sz w:val="20"/>
-                <w:szCs w:val="20"/>
-              </w:rPr>
-              <w:t xml:space="preserve">Note: </w:t>
-            </w:r>
-            <w:r>
-              <w:rPr>
-                <w:rFonts w:ascii="Arial" w:cs="Arial" w:eastAsia="Arial" w:hAnsi="Arial"/>
-                <w:sz w:val="20"/>
-                <w:szCs w:val="20"/>
-              </w:rPr>
-              <w:t xml:space="preserve">On Debian-based systems (including Raspberry Pi OS) use the provided setup.sh script to create a virtual environment. This avoids the externally-managed-environment restriction.</w:t>
+              <w:t xml:space="preserve">Linux, macOS, or Windows — any platform that runs Python 3, including Raspberry Pi OS</w:t>
             </w:r>
           </w:p>
         </w:tc>
@@ -755,23 +690,6 @@
     </w:p>
     <w:p>
       <w:pPr>
-        <w:pStyle w:val="Heading2"/>
-        <w:spacing w:after="80" w:before="240"/>
-      </w:pPr>
-      <w:r>
-        <w:rPr>
-          <w:rFonts w:ascii="Arial" w:cs="Arial" w:eastAsia="Arial" w:hAnsi="Arial"/>
-          <w:b/>
-          <w:bCs/>
-          <w:color w:val="1F5C8B"/>
-          <w:sz w:val="26"/>
-          <w:szCs w:val="26"/>
-        </w:rPr>
-        <w:t xml:space="preserve">3.2  Create a virtual environment and install dependencies</w:t>
-      </w:r>
-    </w:p>
-    <w:p>
-      <w:pPr>
         <w:spacing w:after="100" w:before="60"/>
       </w:pPr>
       <w:r>
@@ -780,52 +698,7 @@
           <w:sz w:val="22"/>
           <w:szCs w:val="22"/>
         </w:rPr>
-        <w:t xml:space="preserve">Run the provided setup script:</w:t>
-      </w:r>
-    </w:p>
-    <w:p>
-      <w:pPr>
-        <w:shd w:fill="F0F0F0" w:val="clear"/>
-        <w:spacing w:after="40" w:before="40"/>
-        <w:ind w:left="360"/>
-      </w:pPr>
-      <w:r>
-        <w:rPr>
-          <w:rFonts w:ascii="Courier New" w:cs="Courier New" w:eastAsia="Courier New" w:hAnsi="Courier New"/>
-          <w:color w:val="1A1A1A"/>
-          <w:sz w:val="18"/>
-          <w:szCs w:val="18"/>
-        </w:rPr>
-        <w:t xml:space="preserve">bash setup.sh</w:t>
-      </w:r>
-    </w:p>
-    <w:p>
-      <w:pPr>
-        <w:spacing w:after="100" w:before="60"/>
-      </w:pPr>
-      <w:r>
-        <w:rPr>
-          <w:rFonts w:ascii="Arial" w:cs="Arial" w:eastAsia="Arial" w:hAnsi="Arial"/>
-          <w:sz w:val="22"/>
-          <w:szCs w:val="22"/>
-        </w:rPr>
-        <w:t xml:space="preserve">This creates a venv/ directory and installs openpyxl into it. On standard Linux/macOS systems you can also install directly:</w:t>
-      </w:r>
-    </w:p>
-    <w:p>
-      <w:pPr>
-        <w:shd w:fill="F0F0F0" w:val="clear"/>
-        <w:spacing w:after="40" w:before="40"/>
-        <w:ind w:left="360"/>
-      </w:pPr>
-      <w:r>
-        <w:rPr>
-          <w:rFonts w:ascii="Courier New" w:cs="Courier New" w:eastAsia="Courier New" w:hAnsi="Courier New"/>
-          <w:color w:val="1A1A1A"/>
-          <w:sz w:val="18"/>
-          <w:szCs w:val="18"/>
-        </w:rPr>
-        <w:t xml:space="preserve">pip3 install -r requirements.txt</w:t>
+        <w:t xml:space="preserve">No additional installation step is required. The listener uses only the Python standard library, so there are no packages to install.</w:t>
       </w:r>
     </w:p>
     <w:p>
@@ -1262,35 +1135,6 @@
           <w:sz w:val="18"/>
           <w:szCs w:val="18"/>
         </w:rPr>
-        <w:t xml:space="preserve">venv/bin/python3 webhook_listener.py</w:t>
-      </w:r>
-    </w:p>
-    <w:p>
-      <w:pPr>
-        <w:spacing w:after="100" w:before="60"/>
-      </w:pPr>
-      <w:r>
-        <w:rPr>
-          <w:rFonts w:ascii="Arial" w:cs="Arial" w:eastAsia="Arial" w:hAnsi="Arial"/>
-          <w:sz w:val="22"/>
-          <w:szCs w:val="22"/>
-        </w:rPr>
-        <w:t xml:space="preserve">On standard systems (no venv):</w:t>
-      </w:r>
-    </w:p>
-    <w:p>
-      <w:pPr>
-        <w:shd w:fill="F0F0F0" w:val="clear"/>
-        <w:spacing w:after="40" w:before="40"/>
-        <w:ind w:left="360"/>
-      </w:pPr>
-      <w:r>
-        <w:rPr>
-          <w:rFonts w:ascii="Courier New" w:cs="Courier New" w:eastAsia="Courier New" w:hAnsi="Courier New"/>
-          <w:color w:val="1A1A1A"/>
-          <w:sz w:val="18"/>
-          <w:szCs w:val="18"/>
-        </w:rPr>
         <w:t xml:space="preserve">python3 webhook_listener.py</w:t>
       </w:r>
     </w:p>
@@ -1438,23 +1282,7 @@
           <w:sz w:val="18"/>
           <w:szCs w:val="18"/>
         </w:rPr>
-        <w:t xml:space="preserve">ExecStart=/path/to/mist-nac-webhook-listener/venv/bin/python3 \</w:t>
-      </w:r>
-    </w:p>
-    <w:p>
-      <w:pPr>
-        <w:shd w:fill="F0F0F0" w:val="clear"/>
-        <w:spacing w:after="40" w:before="40"/>
-        <w:ind w:left="360"/>
-      </w:pPr>
-      <w:r>
-        <w:rPr>
-          <w:rFonts w:ascii="Courier New" w:cs="Courier New" w:eastAsia="Courier New" w:hAnsi="Courier New"/>
-          <w:color w:val="1A1A1A"/>
-          <w:sz w:val="18"/>
-          <w:szCs w:val="18"/>
-        </w:rPr>
-        <w:t xml:space="preserve">          /path/to/mist-nac-webhook-listener/webhook_listener.py</w:t>
+        <w:t xml:space="preserve">ExecStart=/usr/bin/python3 /path/to/mist-nac-webhook-listener/webhook_listener.py</w:t>
       </w:r>
     </w:p>
     <w:p>
@@ -2095,7 +1923,7 @@
           <w:sz w:val="32"/>
           <w:szCs w:val="32"/>
         </w:rPr>
-        <w:t xml:space="preserve">7. Excel Output</w:t>
+        <w:t xml:space="preserve">7. CSV Output</w:t>
       </w:r>
     </w:p>
     <w:p>
@@ -2125,7 +1953,7 @@
           <w:sz w:val="22"/>
           <w:szCs w:val="22"/>
         </w:rPr>
-        <w:t xml:space="preserve">Files are named mist_nac_YYYY-MM-DD.xlsx and written to OUTPUT_DIR. Each day produces one file. If the file already exists (e.g. after restarting the listener on the same day), new rows are appended rather than overwriting existing data.</w:t>
+        <w:t xml:space="preserve">Files are named mist_nac_YYYY-MM-DD.csv and written to OUTPUT_DIR. Each day produces one file. If the file already exists (e.g. after restarting the listener on the same day), new rows are appended rather than overwriting existing data. The header row is written only when the file is first created.</w:t>
       </w:r>
     </w:p>
     <w:p>
@@ -4014,7 +3842,7 @@
           <w:sz w:val="18"/>
           <w:szCs w:val="18"/>
         </w:rPr>
-        <w:t xml:space="preserve">venv/bin/python3 test_webhook.py</w:t>
+        <w:t xml:space="preserve">python3 test_webhook.py</w:t>
       </w:r>
     </w:p>
     <w:p>
@@ -4406,126 +4234,6 @@
                 <w:sz w:val="20"/>
                 <w:szCs w:val="20"/>
               </w:rPr>
-              <w:t xml:space="preserve">externally-managed-environment error</w:t>
-            </w:r>
-          </w:p>
-        </w:tc>
-        <w:tc>
-          <w:tcPr>
-            <w:tcW w:type="dxa" w:w="6240"/>
-            <w:tcBorders>
-              <w:top w:val="single" w:color="CCCCCC" w:sz="1"/>
-              <w:left w:val="single" w:color="CCCCCC" w:sz="1"/>
-              <w:bottom w:val="single" w:color="CCCCCC" w:sz="1"/>
-              <w:right w:val="single" w:color="CCCCCC" w:sz="1"/>
-            </w:tcBorders>
-            <w:shd w:fill="FFFFFF" w:val="clear"/>
-            <w:tcMar>
-              <w:top w:type="dxa" w:w="80"/>
-              <w:left w:type="dxa" w:w="120"/>
-              <w:bottom w:type="dxa" w:w="80"/>
-              <w:right w:type="dxa" w:w="120"/>
-            </w:tcMar>
-          </w:tcPr>
-          <w:p>
-            <w:r>
-              <w:rPr>
-                <w:rFonts w:ascii="Arial" w:cs="Arial" w:eastAsia="Arial" w:hAnsi="Arial"/>
-                <w:sz w:val="20"/>
-                <w:szCs w:val="20"/>
-              </w:rPr>
-              <w:t xml:space="preserve">Run bash setup.sh to create a virtual environment and use venv/bin/python3 to start the listener.</w:t>
-            </w:r>
-          </w:p>
-        </w:tc>
-      </w:tr>
-      <w:tr>
-        <w:tc>
-          <w:tcPr>
-            <w:tcW w:type="dxa" w:w="3120"/>
-            <w:tcBorders>
-              <w:top w:val="single" w:color="CCCCCC" w:sz="1"/>
-              <w:left w:val="single" w:color="CCCCCC" w:sz="1"/>
-              <w:bottom w:val="single" w:color="CCCCCC" w:sz="1"/>
-              <w:right w:val="single" w:color="CCCCCC" w:sz="1"/>
-            </w:tcBorders>
-            <w:shd w:fill="F5F5F5" w:val="clear"/>
-            <w:tcMar>
-              <w:top w:type="dxa" w:w="80"/>
-              <w:left w:type="dxa" w:w="120"/>
-              <w:bottom w:type="dxa" w:w="80"/>
-              <w:right w:type="dxa" w:w="120"/>
-            </w:tcMar>
-          </w:tcPr>
-          <w:p>
-            <w:r>
-              <w:rPr>
-                <w:rFonts w:ascii="Arial" w:cs="Arial" w:eastAsia="Arial" w:hAnsi="Arial"/>
-                <w:b/>
-                <w:bCs/>
-                <w:sz w:val="20"/>
-                <w:szCs w:val="20"/>
-              </w:rPr>
-              <w:t xml:space="preserve">openpyxl not found</w:t>
-            </w:r>
-          </w:p>
-        </w:tc>
-        <w:tc>
-          <w:tcPr>
-            <w:tcW w:type="dxa" w:w="6240"/>
-            <w:tcBorders>
-              <w:top w:val="single" w:color="CCCCCC" w:sz="1"/>
-              <w:left w:val="single" w:color="CCCCCC" w:sz="1"/>
-              <w:bottom w:val="single" w:color="CCCCCC" w:sz="1"/>
-              <w:right w:val="single" w:color="CCCCCC" w:sz="1"/>
-            </w:tcBorders>
-            <w:shd w:fill="F5F5F5" w:val="clear"/>
-            <w:tcMar>
-              <w:top w:type="dxa" w:w="80"/>
-              <w:left w:type="dxa" w:w="120"/>
-              <w:bottom w:type="dxa" w:w="80"/>
-              <w:right w:type="dxa" w:w="120"/>
-            </w:tcMar>
-          </w:tcPr>
-          <w:p>
-            <w:r>
-              <w:rPr>
-                <w:rFonts w:ascii="Arial" w:cs="Arial" w:eastAsia="Arial" w:hAnsi="Arial"/>
-                <w:sz w:val="20"/>
-                <w:szCs w:val="20"/>
-              </w:rPr>
-              <w:t xml:space="preserve">Run bash setup.sh (or pip3 install openpyxl) and ensure you are using the correct Python interpreter.</w:t>
-            </w:r>
-          </w:p>
-        </w:tc>
-      </w:tr>
-      <w:tr>
-        <w:tc>
-          <w:tcPr>
-            <w:tcW w:type="dxa" w:w="3120"/>
-            <w:tcBorders>
-              <w:top w:val="single" w:color="CCCCCC" w:sz="1"/>
-              <w:left w:val="single" w:color="CCCCCC" w:sz="1"/>
-              <w:bottom w:val="single" w:color="CCCCCC" w:sz="1"/>
-              <w:right w:val="single" w:color="CCCCCC" w:sz="1"/>
-            </w:tcBorders>
-            <w:shd w:fill="FFFFFF" w:val="clear"/>
-            <w:tcMar>
-              <w:top w:type="dxa" w:w="80"/>
-              <w:left w:type="dxa" w:w="120"/>
-              <w:bottom w:type="dxa" w:w="80"/>
-              <w:right w:type="dxa" w:w="120"/>
-            </w:tcMar>
-          </w:tcPr>
-          <w:p>
-            <w:r>
-              <w:rPr>
-                <w:rFonts w:ascii="Arial" w:cs="Arial" w:eastAsia="Arial" w:hAnsi="Arial"/>
-                <w:b/>
-                <w:bCs/>
-                <w:sz w:val="20"/>
-                <w:szCs w:val="20"/>
-              </w:rPr>
               <w:t xml:space="preserve">Events received but not saved</w:t>
             </w:r>
           </w:p>
@@ -4602,7 +4310,7 @@
       <w:pPr>
         <w:spacing w:after="100" w:before="60"/>
       </w:pPr>
-      <w:hyperlink w:history="1" r:id="rIdpuksyi55antktkzr_e1t6">
+      <w:hyperlink w:history="1" r:id="rIdc8junctg-xfcmexwpuirr">
         <w:r>
           <w:rPr>
             <w:rStyle w:val="Hyperlink"/>
@@ -4760,127 +4468,7 @@
                 <w:sz w:val="20"/>
                 <w:szCs w:val="20"/>
               </w:rPr>
-              <w:t xml:space="preserve">Main listener script.</w:t>
-            </w:r>
-          </w:p>
-        </w:tc>
-      </w:tr>
-      <w:tr>
-        <w:tc>
-          <w:tcPr>
-            <w:tcW w:type="dxa" w:w="3120"/>
-            <w:tcBorders>
-              <w:top w:val="single" w:color="CCCCCC" w:sz="1"/>
-              <w:left w:val="single" w:color="CCCCCC" w:sz="1"/>
-              <w:bottom w:val="single" w:color="CCCCCC" w:sz="1"/>
-              <w:right w:val="single" w:color="CCCCCC" w:sz="1"/>
-            </w:tcBorders>
-            <w:shd w:fill="FFFFFF" w:val="clear"/>
-            <w:tcMar>
-              <w:top w:type="dxa" w:w="80"/>
-              <w:left w:type="dxa" w:w="120"/>
-              <w:bottom w:type="dxa" w:w="80"/>
-              <w:right w:type="dxa" w:w="120"/>
-            </w:tcMar>
-          </w:tcPr>
-          <w:p>
-            <w:r>
-              <w:rPr>
-                <w:rFonts w:ascii="Arial" w:cs="Arial" w:eastAsia="Arial" w:hAnsi="Arial"/>
-                <w:b/>
-                <w:bCs/>
-                <w:sz w:val="20"/>
-                <w:szCs w:val="20"/>
-              </w:rPr>
-              <w:t xml:space="preserve">requirements.txt</w:t>
-            </w:r>
-          </w:p>
-        </w:tc>
-        <w:tc>
-          <w:tcPr>
-            <w:tcW w:type="dxa" w:w="6240"/>
-            <w:tcBorders>
-              <w:top w:val="single" w:color="CCCCCC" w:sz="1"/>
-              <w:left w:val="single" w:color="CCCCCC" w:sz="1"/>
-              <w:bottom w:val="single" w:color="CCCCCC" w:sz="1"/>
-              <w:right w:val="single" w:color="CCCCCC" w:sz="1"/>
-            </w:tcBorders>
-            <w:shd w:fill="FFFFFF" w:val="clear"/>
-            <w:tcMar>
-              <w:top w:type="dxa" w:w="80"/>
-              <w:left w:type="dxa" w:w="120"/>
-              <w:bottom w:type="dxa" w:w="80"/>
-              <w:right w:type="dxa" w:w="120"/>
-            </w:tcMar>
-          </w:tcPr>
-          <w:p>
-            <w:r>
-              <w:rPr>
-                <w:rFonts w:ascii="Arial" w:cs="Arial" w:eastAsia="Arial" w:hAnsi="Arial"/>
-                <w:sz w:val="20"/>
-                <w:szCs w:val="20"/>
-              </w:rPr>
-              <w:t xml:space="preserve">Python dependency list.</w:t>
-            </w:r>
-          </w:p>
-        </w:tc>
-      </w:tr>
-      <w:tr>
-        <w:tc>
-          <w:tcPr>
-            <w:tcW w:type="dxa" w:w="3120"/>
-            <w:tcBorders>
-              <w:top w:val="single" w:color="CCCCCC" w:sz="1"/>
-              <w:left w:val="single" w:color="CCCCCC" w:sz="1"/>
-              <w:bottom w:val="single" w:color="CCCCCC" w:sz="1"/>
-              <w:right w:val="single" w:color="CCCCCC" w:sz="1"/>
-            </w:tcBorders>
-            <w:shd w:fill="F5F5F5" w:val="clear"/>
-            <w:tcMar>
-              <w:top w:type="dxa" w:w="80"/>
-              <w:left w:type="dxa" w:w="120"/>
-              <w:bottom w:type="dxa" w:w="80"/>
-              <w:right w:type="dxa" w:w="120"/>
-            </w:tcMar>
-          </w:tcPr>
-          <w:p>
-            <w:r>
-              <w:rPr>
-                <w:rFonts w:ascii="Arial" w:cs="Arial" w:eastAsia="Arial" w:hAnsi="Arial"/>
-                <w:b/>
-                <w:bCs/>
-                <w:sz w:val="20"/>
-                <w:szCs w:val="20"/>
-              </w:rPr>
-              <w:t xml:space="preserve">setup.sh</w:t>
-            </w:r>
-          </w:p>
-        </w:tc>
-        <w:tc>
-          <w:tcPr>
-            <w:tcW w:type="dxa" w:w="6240"/>
-            <w:tcBorders>
-              <w:top w:val="single" w:color="CCCCCC" w:sz="1"/>
-              <w:left w:val="single" w:color="CCCCCC" w:sz="1"/>
-              <w:bottom w:val="single" w:color="CCCCCC" w:sz="1"/>
-              <w:right w:val="single" w:color="CCCCCC" w:sz="1"/>
-            </w:tcBorders>
-            <w:shd w:fill="F5F5F5" w:val="clear"/>
-            <w:tcMar>
-              <w:top w:type="dxa" w:w="80"/>
-              <w:left w:type="dxa" w:w="120"/>
-              <w:bottom w:type="dxa" w:w="80"/>
-              <w:right w:type="dxa" w:w="120"/>
-            </w:tcMar>
-          </w:tcPr>
-          <w:p>
-            <w:r>
-              <w:rPr>
-                <w:rFonts w:ascii="Arial" w:cs="Arial" w:eastAsia="Arial" w:hAnsi="Arial"/>
-                <w:sz w:val="20"/>
-                <w:szCs w:val="20"/>
-              </w:rPr>
-              <w:t xml:space="preserve">Virtual environment setup script for Debian-based systems.</w:t>
+              <w:t xml:space="preserve">Main listener script — no dependencies beyond the Python standard library.</w:t>
             </w:r>
           </w:p>
         </w:tc>

</xml_diff>